<commit_message>
Modificacion competencias de proyecto
</commit_message>
<xml_diff>
--- a/Fase 1/Evidencias Grupales/1.5_GuiaEstudiante_Fase 1_Definicion Proyecto APT.docx
+++ b/Fase 1/Evidencias Grupales/1.5_GuiaEstudiante_Fase 1_Definicion Proyecto APT.docx
@@ -128,8 +128,18 @@
                                     <w:color w:val="1F3864"/>
                                     <w:sz w:val="48"/>
                                   </w:rPr>
-                                  <w:t>Asignatura Capstone</w:t>
+                                  <w:t xml:space="preserve">Asignatura </w:t>
                                 </w:r>
+                                <w:proofErr w:type="spellStart"/>
+                                <w:r>
+                                  <w:rPr>
+                                    <w:b/>
+                                    <w:color w:val="1F3864"/>
+                                    <w:sz w:val="48"/>
+                                  </w:rPr>
+                                  <w:t>Capstone</w:t>
+                                </w:r>
+                                <w:proofErr w:type="spellEnd"/>
                               </w:p>
                             </w:txbxContent>
                           </wps:txbx>
@@ -176,47 +186,87 @@
               </wp:anchor>
             </w:drawing>
           </mc:Choice>
-          <mc:Fallback xmlns:cr="http://schemas.microsoft.com/office/comments/2020/reactions" xmlns="http://schemas.microsoft.com/office/tasks/2019/documenttasks" xmlns:dgm="http://schemas.openxmlformats.org/drawingml/2006/diagram" xmlns:lc="http://schemas.openxmlformats.org/drawingml/2006/lockedCanvas" xmlns:c="http://schemas.openxmlformats.org/drawingml/2006/chart" xmlns:pic="http://schemas.openxmlformats.org/drawingml/2006/picture" xmlns:a="http://schemas.openxmlformats.org/drawingml/2006/main" xmlns:sl="http://schemas.openxmlformats.org/schemaLibrary/2006/main">
-            <w:drawing>
-              <wp:anchor allowOverlap="1" behindDoc="0" distB="0" distT="0" distL="114300" distR="114300" hidden="0" layoutInCell="1" locked="0" relativeHeight="0" simplePos="0">
-                <wp:simplePos x="0" y="0"/>
-                <wp:positionH relativeFrom="column">
-                  <wp:posOffset>-435398</wp:posOffset>
-                </wp:positionH>
-                <wp:positionV relativeFrom="paragraph">
-                  <wp:posOffset>33444</wp:posOffset>
-                </wp:positionV>
-                <wp:extent cx="6580505" cy="1486535"/>
-                <wp:effectExtent b="0" l="0" r="0" t="0"/>
-                <wp:wrapNone/>
-                <wp:docPr id="48" name="image2.png"/>
-                <a:graphic>
-                  <a:graphicData uri="http://schemas.openxmlformats.org/drawingml/2006/picture">
-                    <pic:pic>
-                      <pic:nvPicPr>
-                        <pic:cNvPr id="0" name="image2.png"/>
-                        <pic:cNvPicPr preferRelativeResize="0"/>
-                      </pic:nvPicPr>
-                      <pic:blipFill>
-                        <a:blip r:embed="rId8"/>
-                        <a:srcRect/>
-                        <a:stretch>
-                          <a:fillRect/>
-                        </a:stretch>
-                      </pic:blipFill>
-                      <pic:spPr>
-                        <a:xfrm>
-                          <a:off x="0" y="0"/>
-                          <a:ext cx="6580505" cy="1486535"/>
-                        </a:xfrm>
-                        <a:prstGeom prst="rect"/>
-                        <a:ln/>
-                      </pic:spPr>
-                    </pic:pic>
-                  </a:graphicData>
-                </a:graphic>
-              </wp:anchor>
-            </w:drawing>
+          <mc:Fallback>
+            <w:pict>
+              <v:group w14:anchorId="3BF77449" id="Grupo 48" o:spid="_x0000_s1026" style="position:absolute;margin-left:-34.3pt;margin-top:2.65pt;width:518.15pt;height:117.05pt;z-index:251658240" coordorigin="20557,30367" coordsize="65805,14865" o:gfxdata="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">
+                <v:group id="Grupo 1770158719" o:spid="_x0000_s1027" style="position:absolute;left:20557;top:30367;width:65805;height:14865" coordsize="59034,14868" o:gfxdata="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">
+                  <v:rect id="Rectángulo 90335669" o:spid="_x0000_s1028" style="position:absolute;width:59034;height:14868;visibility:visible;mso-wrap-style:square;v-text-anchor:middle" o:gfxdata="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" filled="f" stroked="f">
+                    <v:textbox inset="2.53958mm,2.53958mm,2.53958mm,2.53958mm">
+                      <w:txbxContent>
+                        <w:p>
+                          <w:pPr>
+                            <w:spacing w:after="0" w:line="240" w:lineRule="auto"/>
+                            <w:textDirection w:val="btLr"/>
+                          </w:pPr>
+                        </w:p>
+                      </w:txbxContent>
+                    </v:textbox>
+                  </v:rect>
+                  <v:rect id="Rectángulo 1097612135" o:spid="_x0000_s1029" style="position:absolute;left:10247;top:2391;width:48787;height:12363;visibility:visible;mso-wrap-style:square;v-text-anchor:top" o:gfxdata="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" filled="f" stroked="f">
+                    <v:textbox inset="2.53958mm,1.2694mm,2.53958mm,1.2694mm">
+                      <w:txbxContent>
+                        <w:p>
+                          <w:pPr>
+                            <w:spacing w:after="0" w:line="240" w:lineRule="auto"/>
+                            <w:textDirection w:val="btLr"/>
+                          </w:pPr>
+                        </w:p>
+                        <w:p>
+                          <w:pPr>
+                            <w:spacing w:after="0" w:line="240" w:lineRule="auto"/>
+                            <w:textDirection w:val="btLr"/>
+                          </w:pPr>
+                          <w:r>
+                            <w:rPr>
+                              <w:b/>
+                              <w:color w:val="1F3864"/>
+                              <w:sz w:val="48"/>
+                            </w:rPr>
+                            <w:t xml:space="preserve">Guía1. Definición Proyecto APT </w:t>
+                          </w:r>
+                        </w:p>
+                        <w:p>
+                          <w:pPr>
+                            <w:spacing w:after="0" w:line="240" w:lineRule="auto"/>
+                            <w:textDirection w:val="btLr"/>
+                          </w:pPr>
+                          <w:r>
+                            <w:rPr>
+                              <w:b/>
+                              <w:color w:val="1F3864"/>
+                              <w:sz w:val="48"/>
+                            </w:rPr>
+                            <w:t xml:space="preserve">Asignatura </w:t>
+                          </w:r>
+                          <w:proofErr w:type="spellStart"/>
+                          <w:r>
+                            <w:rPr>
+                              <w:b/>
+                              <w:color w:val="1F3864"/>
+                              <w:sz w:val="48"/>
+                            </w:rPr>
+                            <w:t>Capstone</w:t>
+                          </w:r>
+                          <w:proofErr w:type="spellEnd"/>
+                        </w:p>
+                      </w:txbxContent>
+                    </v:textbox>
+                  </v:rect>
+                  <v:rect id="Rectángulo 1278612729" o:spid="_x0000_s1030" style="position:absolute;width:9931;height:14868;visibility:visible;mso-wrap-style:square;v-text-anchor:middle" o:gfxdata="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" fillcolor="#1f3864" stroked="f">
+                    <v:textbox inset="2.53958mm,2.53958mm,2.53958mm,2.53958mm">
+                      <w:txbxContent>
+                        <w:p>
+                          <w:pPr>
+                            <w:spacing w:after="0" w:line="240" w:lineRule="auto"/>
+                            <w:textDirection w:val="btLr"/>
+                          </w:pPr>
+                        </w:p>
+                      </w:txbxContent>
+                    </v:textbox>
+                  </v:rect>
+                </v:group>
+              </v:group>
+            </w:pict>
           </mc:Fallback>
         </mc:AlternateContent>
       </w:r>
@@ -739,9 +789,11 @@
                 <w:szCs w:val="24"/>
               </w:rPr>
             </w:pPr>
+            <w:proofErr w:type="spellStart"/>
             <w:r>
               <w:t>RehabControl</w:t>
             </w:r>
+            <w:proofErr w:type="spellEnd"/>
           </w:p>
         </w:tc>
       </w:tr>
@@ -832,160 +884,71 @@
           </w:tcPr>
           <w:p>
             <w:pPr>
-              <w:numPr>
-                <w:ilvl w:val="0"/>
-                <w:numId w:val="6"/>
-              </w:numPr>
-              <w:spacing w:before="240" w:after="0"/>
-            </w:pPr>
-            <w:r>
-              <w:t>Desarrollar una solución de software utilizando técnicas que permitan sistematizar el proceso de desarrollo y mantenimiento.</w:t>
-            </w:r>
-          </w:p>
-          <w:p>
-            <w:pPr>
-              <w:numPr>
-                <w:ilvl w:val="0"/>
-                <w:numId w:val="6"/>
-              </w:numPr>
-              <w:spacing w:after="0"/>
-            </w:pPr>
+              <w:spacing w:after="240"/>
+            </w:pPr>
+            <w:r>
+              <w:t xml:space="preserve"> </w:t>
+            </w:r>
+            <w:r>
+              <w:t>● Desarrollar una solución de software para sistematizar la gestión de pacientes, reservas y tratamientos kinesiológicos.</w:t>
+            </w:r>
+            <w:r>
+              <w:br/>
+              <w:t>● Construir modelos de datos para almacenar información de pacientes, sesiones, fichas clínicas y pagos de manera escalable.</w:t>
+            </w:r>
+            <w:r>
+              <w:br/>
+              <w:t xml:space="preserve">● Programar consultas para gestionar información relacionada con </w:t>
+            </w:r>
             <w:r>
               <w:lastRenderedPageBreak/>
-              <w:t>Construir modelos de datos para soportar los requerimientos de la solución, de acuerdo a un diseño definido y escalable en el tiempo.</w:t>
-            </w:r>
-          </w:p>
-          <w:p>
-            <w:pPr>
-              <w:numPr>
-                <w:ilvl w:val="0"/>
-                <w:numId w:val="6"/>
-              </w:numPr>
-              <w:spacing w:after="0"/>
-            </w:pPr>
-            <w:r>
-              <w:t>Programar consultas para manipular información de una base de datos.</w:t>
-            </w:r>
-          </w:p>
-          <w:p>
-            <w:pPr>
-              <w:numPr>
-                <w:ilvl w:val="0"/>
-                <w:numId w:val="6"/>
-              </w:numPr>
-              <w:spacing w:after="0"/>
-            </w:pPr>
-            <w:r>
-              <w:t>Construir programas de variada complejidad, utilizando tecnologías modernas y buenas prácticas de codificación y gestión.</w:t>
-            </w:r>
-          </w:p>
-          <w:p>
-            <w:pPr>
-              <w:numPr>
-                <w:ilvl w:val="0"/>
-                <w:numId w:val="6"/>
-              </w:numPr>
-              <w:spacing w:after="0"/>
-            </w:pPr>
-            <w:r>
-              <w:t>Construir el modelo arquitectónico de una solución sistémica que soporte procesos de negocio.</w:t>
-            </w:r>
-          </w:p>
-          <w:p>
-            <w:pPr>
-              <w:numPr>
-                <w:ilvl w:val="0"/>
-                <w:numId w:val="6"/>
-              </w:numPr>
-              <w:spacing w:after="0"/>
-            </w:pPr>
-            <w:r>
-              <w:t>Implementar soluciones sistémicas integrales para automatizar y optimizar procesos de negocio.</w:t>
-            </w:r>
-          </w:p>
-          <w:p>
-            <w:pPr>
-              <w:numPr>
-                <w:ilvl w:val="0"/>
-                <w:numId w:val="6"/>
-              </w:numPr>
-              <w:spacing w:after="0"/>
-            </w:pPr>
-            <w:r>
-              <w:t>Ofrecer propuestas de solución informática analizando de forma integral los procesos de acuerdo a los requerimientos definidos.</w:t>
-            </w:r>
-          </w:p>
-          <w:p>
-            <w:pPr>
-              <w:numPr>
-                <w:ilvl w:val="0"/>
-                <w:numId w:val="6"/>
-              </w:numPr>
-              <w:spacing w:after="0"/>
-            </w:pPr>
-            <w:r>
-              <w:t>Realizar pruebas de productos y procesos utilizando buenas prácticas definidas por la industria.</w:t>
-            </w:r>
-          </w:p>
-          <w:p>
-            <w:pPr>
-              <w:numPr>
-                <w:ilvl w:val="0"/>
-                <w:numId w:val="6"/>
-              </w:numPr>
-              <w:spacing w:after="0"/>
-            </w:pPr>
-            <w:r>
-              <w:t>Gestionar proyectos informáticos, ofreciendo alternativas para la toma de decisiones.</w:t>
-            </w:r>
-          </w:p>
-          <w:p>
-            <w:pPr>
-              <w:numPr>
-                <w:ilvl w:val="0"/>
-                <w:numId w:val="6"/>
-              </w:numPr>
-              <w:spacing w:after="0"/>
-            </w:pPr>
-            <w:r>
-              <w:t>Comunicar en forma oral y escrita aplicando herramientas lingüísticas y estrategias de comprensión en contextos académicos.</w:t>
-            </w:r>
-          </w:p>
-          <w:p>
-            <w:pPr>
-              <w:numPr>
-                <w:ilvl w:val="0"/>
-                <w:numId w:val="6"/>
-              </w:numPr>
-              <w:spacing w:after="0"/>
-            </w:pPr>
-            <w:r>
-              <w:t>Desarrollar la habilidad emprendedora mediante experiencias en el ámbito de la especialidad.</w:t>
-            </w:r>
-          </w:p>
-          <w:p>
-            <w:pPr>
-              <w:numPr>
-                <w:ilvl w:val="0"/>
-                <w:numId w:val="6"/>
-              </w:numPr>
-              <w:spacing w:after="0"/>
-            </w:pPr>
-            <w:r>
-              <w:t>Elaborar proyectos innovadores que agreguen valor a contextos productivos.</w:t>
-            </w:r>
-          </w:p>
-          <w:p>
-            <w:pPr>
-              <w:numPr>
-                <w:ilvl w:val="0"/>
-                <w:numId w:val="6"/>
-              </w:numPr>
+              <w:t>pacientes, atenciones y reservas dentro de la base de datos.</w:t>
+            </w:r>
+            <w:r>
+              <w:br/>
+              <w:t>● Construir una aplicación web utilizando tecnologías modernas y buenas prácticas de programación.</w:t>
+            </w:r>
+            <w:r>
+              <w:br/>
+              <w:t>● Diseñar una arquitectura de software que soporte los procesos de atención y administración del centro kinesiológico.</w:t>
+            </w:r>
+            <w:r>
+              <w:br/>
+              <w:t>● Implementar una solución informática para automatizar procesos como reservas, control de sesiones y gestión de pacientes.</w:t>
+            </w:r>
+            <w:r>
+              <w:br/>
+              <w:t>● Analizar los requerimientos del centro kinesiológico para proponer una solución informática adecuada.</w:t>
+            </w:r>
+            <w:r>
+              <w:br/>
+              <w:t>● Realizar pruebas funcionales para validar el correcto funcionamiento del sistema desarrollado.</w:t>
+            </w:r>
+            <w:r>
+              <w:br/>
+              <w:t>● Gestionar el desarrollo del proyecto mediante planificación de tareas, organización y toma de decisiones técnicas.</w:t>
+            </w:r>
+            <w:r>
+              <w:br/>
+              <w:t>● Comunicar avances, documentación y resultados del proyecto de forma oral y escrita.</w:t>
+            </w:r>
+            <w:r>
+              <w:br/>
+              <w:t>● Desarrollar una solución tecnológica orientada a mejorar la atención y gestión en el área de kinesiología.</w:t>
+            </w:r>
+            <w:r>
+              <w:br/>
+              <w:t>● Elaborar un proyecto innovador que optimice los procesos administrativos y clínicos del centro kinesiológico.</w:t>
+            </w:r>
+            <w:r>
+              <w:br/>
+              <w:t>● Aplicar buenas prácticas y estándares profesionales durante el desarrollo del sistema informático.</w:t>
+            </w:r>
+          </w:p>
+          <w:p>
+            <w:pPr>
               <w:spacing w:after="240"/>
             </w:pPr>
-            <w:r>
-              <w:t>Reconocer un desempeño correcto en situaciones de la profesión o especialidad en informática.</w:t>
-            </w:r>
           </w:p>
         </w:tc>
       </w:tr>
@@ -1174,7 +1137,23 @@
               <w:jc w:val="both"/>
             </w:pPr>
             <w:r>
-              <w:t>El presente proyecto surge de la necesidad de resolver una brecha tecnológica significativa en el sector de la salud privada,  específicamente en la rehabilitación física. La problemática principal radica en que los centros de kinesiologia operan bajo una lógica distinta a la consulta médica tradicional, requiriendo la coordinación simultánea de tres factores: el profesional, el paciente y un recurso físico específico (box de atención o maquinaria). Al utilizar software genérico, se generan constantes colisiones de recursos, además de una fragmentación entre la ficha clínica del paciente y las rutinas de ejercicios que debe realizar en su domicilio, lo que deriva en una baja adherencia terapéutica y retrasos en su recuperación.</w:t>
+              <w:t xml:space="preserve">El presente proyecto surge de la necesidad de resolver una brecha tecnológica significativa en el sector de la salud </w:t>
+            </w:r>
+            <w:proofErr w:type="gramStart"/>
+            <w:r>
+              <w:t>privada,  específicamente</w:t>
+            </w:r>
+            <w:proofErr w:type="gramEnd"/>
+            <w:r>
+              <w:t xml:space="preserve"> en la rehabilitación física. La problemática principal radica en que los centros de </w:t>
+            </w:r>
+            <w:proofErr w:type="spellStart"/>
+            <w:r>
+              <w:t>kinesiologia</w:t>
+            </w:r>
+            <w:proofErr w:type="spellEnd"/>
+            <w:r>
+              <w:t xml:space="preserve"> operan bajo una lógica distinta a la consulta médica tradicional, requiriendo la coordinación simultánea de tres factores: el profesional, el paciente y un recurso físico específico (box de atención o maquinaria). Al utilizar software genérico, se generan constantes colisiones de recursos, además de una fragmentación entre la ficha clínica del paciente y las rutinas de ejercicios que debe realizar en su domicilio, lo que deriva en una baja adherencia terapéutica y retrasos en su recuperación.</w:t>
             </w:r>
           </w:p>
           <w:p>
@@ -1189,8 +1168,11 @@
               <w:jc w:val="both"/>
             </w:pPr>
             <w:r>
+              <w:t xml:space="preserve">La elección de este tema es altamente relevante para el campo de la Ingeniería en Informática, ya que plantea un desafío de diseñar una arquitectura de software compleja y escalable. Su desarrollo exige la implementación de un ecosistema que sincroniza en tiempo real múltiples plataformas (Web y Móvil) </w:t>
+            </w:r>
+            <w:r>
               <w:lastRenderedPageBreak/>
-              <w:t>La elección de este tema es altamente relevante para el campo de la Ingeniería en Informática, ya que plantea un desafío de diseñar una arquitectura de software compleja y escalable. Su desarrollo exige la implementación de un ecosistema que sincroniza en tiempo real múltiples plataformas (Web y Móvil) a través de una API centralizada, además de requerir modelamiento de bases de datos relacionales avanzadas para manejar la lógica del agendamiento y la gestión segura de datos clínicos sensibles.</w:t>
+              <w:t>a través de una API centralizada, además de requerir modelamiento de bases de datos relacionales avanzadas para manejar la lógica del agendamiento y la gestión segura de datos clínicos sensibles.</w:t>
             </w:r>
           </w:p>
           <w:p>
@@ -1279,7 +1261,15 @@
               <w:jc w:val="both"/>
             </w:pPr>
             <w:r>
-              <w:t>Pacientes en rehabilitación: Quienes al no contar con un apoyo visual y recordatorios para sus ejercicios en casa, tienden a abandonar o ejecutar mal su tratamiento.</w:t>
+              <w:t xml:space="preserve">Pacientes en rehabilitación: </w:t>
+            </w:r>
+            <w:proofErr w:type="gramStart"/>
+            <w:r>
+              <w:t>Quienes</w:t>
+            </w:r>
+            <w:proofErr w:type="gramEnd"/>
+            <w:r>
+              <w:t xml:space="preserve"> al no contar con un apoyo visual y recordatorios para sus ejercicios en casa, tienden a abandonar o ejecutar mal su tratamiento.</w:t>
             </w:r>
           </w:p>
           <w:p>
@@ -1354,11 +1344,7 @@
               <w:jc w:val="both"/>
             </w:pPr>
             <w:r>
-              <w:t xml:space="preserve">Plataforma Web (Gestión Clínica y Administrativa): Proveerá un entorno unificado para los profesionales y el personal administrativo. Contará con un módulo de agendamiento para coordinar y administrar las citas entre kinesiólogos y pacientes, optimizando el flujo de atención diaria. Además, integrará una Ficha Clínica Electrónica especializada, permitiendo al profesional registrar la </w:t>
-            </w:r>
-            <w:r>
-              <w:lastRenderedPageBreak/>
-              <w:t>evolución física del paciente sesión a sesión y prescribir rutinas de ejercicios de manera estructurada.</w:t>
+              <w:t>Plataforma Web (Gestión Clínica y Administrativa): Proveerá un entorno unificado para los profesionales y el personal administrativo. Contará con un módulo de agendamiento para coordinar y administrar las citas entre kinesiólogos y pacientes, optimizando el flujo de atención diaria. Además, integrará una Ficha Clínica Electrónica especializada, permitiendo al profesional registrar la evolución física del paciente sesión a sesión y prescribir rutinas de ejercicios de manera estructurada.</w:t>
             </w:r>
           </w:p>
           <w:p>
@@ -1370,8 +1356,17 @@
               <w:jc w:val="both"/>
             </w:pPr>
             <w:r>
-              <w:t>Aplicación Móvil (Seguimiento del Paciente): Para combatir la baja adherencia a los tratamientos en el hogar, se desplegará una aplicación móvil diseñada para involucrar activamente al paciente en su recuperación. El usuario podrá visualizar de forma didáctica los ejercicios prescritos por su kinesiólogo, registrar su nivel de cumplimiento y dolor tras cada práctica (retroalimentación clínica) y gestionar sus próximas sesiones presenciales mediante un sistema automatizado de notificaciones push</w:t>
-            </w:r>
+              <w:t xml:space="preserve">Aplicación Móvil (Seguimiento del Paciente): Para combatir la baja adherencia a los tratamientos en el hogar, se desplegará una </w:t>
+            </w:r>
+            <w:r>
+              <w:lastRenderedPageBreak/>
+              <w:t xml:space="preserve">aplicación móvil diseñada para involucrar activamente al paciente en su recuperación. El usuario podrá visualizar de forma didáctica los ejercicios prescritos por su kinesiólogo, registrar su nivel de cumplimiento y dolor tras cada práctica (retroalimentación clínica) y gestionar sus próximas sesiones presenciales mediante un sistema automatizado de notificaciones </w:t>
+            </w:r>
+            <w:proofErr w:type="spellStart"/>
+            <w:r>
+              <w:t>push</w:t>
+            </w:r>
+            <w:proofErr w:type="spellEnd"/>
           </w:p>
         </w:tc>
       </w:tr>
@@ -1409,7 +1404,15 @@
               <w:jc w:val="both"/>
             </w:pPr>
             <w:r>
-              <w:t>El proyecto RehabControl constituye una integración práctica de las capacidades declaradas en el perfil de egreso de Ingeniería en Informática. La pertinencia de este proyecto radica en que la problemática planteada no puede resolverse con herramientas genéricas, sino que exige una intervención de ingeniería para transformar procesos manuales en procesos seguros.</w:t>
+              <w:t xml:space="preserve">El proyecto </w:t>
+            </w:r>
+            <w:proofErr w:type="spellStart"/>
+            <w:r>
+              <w:t>RehabControl</w:t>
+            </w:r>
+            <w:proofErr w:type="spellEnd"/>
+            <w:r>
+              <w:t xml:space="preserve"> constituye una integración práctica de las capacidades declaradas en el perfil de egreso de Ingeniería en Informática. La pertinencia de este proyecto radica en que la problemática planteada no puede resolverse con herramientas genéricas, sino que exige una intervención de ingeniería para transformar procesos manuales en procesos seguros.</w:t>
             </w:r>
           </w:p>
           <w:p>
@@ -1482,8 +1485,19 @@
               <w:jc w:val="both"/>
             </w:pPr>
             <w:r>
+              <w:t xml:space="preserve">Ética y Responsabilidad Profesional (Competencia Transversal): Dado que </w:t>
+            </w:r>
+            <w:proofErr w:type="spellStart"/>
+            <w:r>
+              <w:t>RehabControl</w:t>
+            </w:r>
+            <w:proofErr w:type="spellEnd"/>
+            <w:r>
+              <w:t xml:space="preserve"> maneja datos sensibles de salud, esta competencia es necesaria para aplicar estándares de seguridad y confidencialidad. La resolución del problema no es solo técnica, sino también ética, </w:t>
+            </w:r>
+            <w:r>
               <w:lastRenderedPageBreak/>
-              <w:t>Ética y Responsabilidad Profesional (Competencia Transversal): Dado que RehabControl maneja datos sensibles de salud, esta competencia es necesaria para aplicar estándares de seguridad y confidencialidad. La resolución del problema no es solo técnica, sino también ética, asegurando que el acceso a las fichas clínicas esté restringido y protegido según la normativa vigente.</w:t>
+              <w:t>asegurando que el acceso a las fichas clínicas esté restringido y protegido según la normativa vigente.</w:t>
             </w:r>
           </w:p>
           <w:p>
@@ -1537,7 +1551,15 @@
               </w:rPr>
             </w:pPr>
             <w:r>
-              <w:t>El proyecto se vincula con el interés del equipo por el desarrollo de aplicaciones Full-Stack y la arquitectura de sistemas móviles bajo estándares modernos. Para los integrantes, RehabControl representa el desafío de integrar servicios en la nube con interfaces de usuario de alta fidelidad, permitiéndonos consolidar conocimientos en el manejo de datos sensibles y la sincronización de plataformas en tiempo real, áreas clave para nuestra futura inserción en el mercado de desarrollo de software médico</w:t>
+              <w:t xml:space="preserve">El proyecto se vincula con el interés del equipo por el desarrollo de aplicaciones Full-Stack y la arquitectura de sistemas móviles bajo estándares modernos. Para los integrantes, </w:t>
+            </w:r>
+            <w:proofErr w:type="spellStart"/>
+            <w:r>
+              <w:t>RehabControl</w:t>
+            </w:r>
+            <w:proofErr w:type="spellEnd"/>
+            <w:r>
+              <w:t xml:space="preserve"> representa el desafío de integrar servicios en la nube con interfaces de usuario de alta fidelidad, permitiéndonos consolidar conocimientos en el manejo de datos sensibles y la sincronización de plataformas en tiempo real, áreas clave para nuestra futura inserción en el mercado de desarrollo de software médico</w:t>
             </w:r>
           </w:p>
         </w:tc>
@@ -1581,7 +1603,55 @@
               </w:pBdr>
             </w:pPr>
             <w:r>
-              <w:t>El desarrollo del proyecto es factible dentro de las 16 semanas de duración del semestre, considerando un trabajo en clases pedagógicas de 3 horas aproximadamente a la semana y de 5 horas de trabajo autónomo y de la asignatura asignadas al equipo de tres integrantes. A nivel de materiales, se cuenta con equipos de computación personales y acceso a herramientas de desarrollo y servidores en la nube en sus capas gratuitas (GitHub, bases de datos PostgreSQL, Supabase, Firebase, entre otras). Un factor externo que facilita el desarrollo es el amplio acceso a documentación técnica y la clara división de roles (Backend, Frontend y Móvil). El principal factor externo que podría dificultar la ejecución son los problemas de integración entre la app móvil y la API; esto se solucionará aplicando metodología Scrum con sprints cortos para detectar y corregir errores tempranamente</w:t>
+              <w:t xml:space="preserve">El desarrollo del proyecto es factible dentro de las 16 semanas de duración del semestre, considerando un trabajo en clases pedagógicas de 3 horas aproximadamente a la semana y de 5 horas de trabajo autónomo y de la asignatura asignadas al equipo de tres integrantes. A nivel de materiales, se cuenta con equipos de computación personales y acceso a herramientas de desarrollo y servidores en la nube en sus capas gratuitas (GitHub, bases de datos PostgreSQL, </w:t>
+            </w:r>
+            <w:proofErr w:type="spellStart"/>
+            <w:r>
+              <w:t>Supabase</w:t>
+            </w:r>
+            <w:proofErr w:type="spellEnd"/>
+            <w:r>
+              <w:t xml:space="preserve">, </w:t>
+            </w:r>
+            <w:proofErr w:type="spellStart"/>
+            <w:r>
+              <w:t>Firebase</w:t>
+            </w:r>
+            <w:proofErr w:type="spellEnd"/>
+            <w:r>
+              <w:t>, entre otras). Un factor externo que facilita el desarrollo es el amplio acceso a documentación técnica y la clara división de roles (</w:t>
+            </w:r>
+            <w:proofErr w:type="spellStart"/>
+            <w:r>
+              <w:t>Backend</w:t>
+            </w:r>
+            <w:proofErr w:type="spellEnd"/>
+            <w:r>
+              <w:t xml:space="preserve">, </w:t>
+            </w:r>
+            <w:proofErr w:type="spellStart"/>
+            <w:r>
+              <w:t>Frontend</w:t>
+            </w:r>
+            <w:proofErr w:type="spellEnd"/>
+            <w:r>
+              <w:t xml:space="preserve"> y Móvil). El principal factor externo que podría dificultar la ejecución son los problemas de integración entre la </w:t>
+            </w:r>
+            <w:proofErr w:type="gramStart"/>
+            <w:r>
+              <w:t>app</w:t>
+            </w:r>
+            <w:proofErr w:type="gramEnd"/>
+            <w:r>
+              <w:t xml:space="preserve"> móvil y la API; esto se solucionará aplicando metodología Scrum con </w:t>
+            </w:r>
+            <w:proofErr w:type="spellStart"/>
+            <w:r>
+              <w:t>sprints</w:t>
+            </w:r>
+            <w:proofErr w:type="spellEnd"/>
+            <w:r>
+              <w:t xml:space="preserve"> cortos para detectar y corregir errores tempranamente</w:t>
             </w:r>
           </w:p>
         </w:tc>
@@ -2091,7 +2161,31 @@
               </w:rPr>
             </w:pPr>
             <w:r>
-              <w:t>Para abordar el problema se desarrollará un sistema digital orientado a mejorar la gestión de citas y el seguimiento terapéutico de los pacientes en centros de kinesiología, reemplazando procesos manuales por una solución más eficiente y organizada. Para ello se utilizará la metodología ágil Scrum, trabajando en sprints de dos semanas que permitirán implementar funcionalidades de forma progresiva, como el registro de usuarios, gestión de pacientes, agenda de citas y seguimiento de tratamientos, facilitando la mejora continua del sistema. El equipo se organizará de manera colaborativa, definiendo roles como Scrum Master, Product Owner y desarrolladores, distribuyendo tareas de desarrollo, pruebas y documentación para asegurar el cumplimiento de los objetivos del proyecto.</w:t>
+              <w:t xml:space="preserve">Para abordar el problema se desarrollará un sistema digital orientado a mejorar la gestión de citas y el seguimiento terapéutico de los pacientes en centros de kinesiología, reemplazando procesos manuales por una solución más eficiente y organizada. Para ello se utilizará la metodología ágil Scrum, trabajando en </w:t>
+            </w:r>
+            <w:proofErr w:type="spellStart"/>
+            <w:r>
+              <w:t>sprints</w:t>
+            </w:r>
+            <w:proofErr w:type="spellEnd"/>
+            <w:r>
+              <w:t xml:space="preserve"> de dos semanas que permitirán implementar funcionalidades de forma progresiva, como el registro de usuarios, gestión de pacientes, agenda de citas y seguimiento de tratamientos, facilitando la mejora continua del sistema. El equipo se organizará de manera colaborativa, definiendo roles como Scrum </w:t>
+            </w:r>
+            <w:proofErr w:type="gramStart"/>
+            <w:r>
+              <w:t>Master</w:t>
+            </w:r>
+            <w:proofErr w:type="gramEnd"/>
+            <w:r>
+              <w:t xml:space="preserve">, </w:t>
+            </w:r>
+            <w:proofErr w:type="spellStart"/>
+            <w:r>
+              <w:t>Product</w:t>
+            </w:r>
+            <w:proofErr w:type="spellEnd"/>
+            <w:r>
+              <w:t xml:space="preserve"> Owner y desarrolladores, distribuyendo tareas de desarrollo, pruebas y documentación para asegurar el cumplimiento de los objetivos del proyecto.</w:t>
             </w:r>
           </w:p>
         </w:tc>
@@ -3086,8 +3180,13 @@
               <w:spacing w:after="0" w:line="240" w:lineRule="auto"/>
               <w:jc w:val="center"/>
             </w:pPr>
-            <w:r>
-              <w:t>Product Backlog Puntos Historia</w:t>
+            <w:proofErr w:type="spellStart"/>
+            <w:r>
+              <w:t>Product</w:t>
+            </w:r>
+            <w:proofErr w:type="spellEnd"/>
+            <w:r>
+              <w:t xml:space="preserve"> Backlog Puntos Historia</w:t>
             </w:r>
           </w:p>
         </w:tc>
@@ -3905,7 +4004,21 @@
               <w:rPr>
                 <w:color w:val="1F3864"/>
               </w:rPr>
-              <w:t>En la siguiente tabla define la planificación de tu Proyecto APT de acuerdo a lo requerido.</w:t>
+              <w:t xml:space="preserve">En la siguiente tabla define la planificación de tu Proyecto APT </w:t>
+            </w:r>
+            <w:proofErr w:type="gramStart"/>
+            <w:r>
+              <w:rPr>
+                <w:color w:val="1F3864"/>
+              </w:rPr>
+              <w:t>de acuerdo a</w:t>
+            </w:r>
+            <w:proofErr w:type="gramEnd"/>
+            <w:r>
+              <w:rPr>
+                <w:color w:val="1F3864"/>
+              </w:rPr>
+              <w:t xml:space="preserve"> lo requerido.</w:t>
             </w:r>
           </w:p>
         </w:tc>
@@ -4015,7 +4128,21 @@
               <w:rPr>
                 <w:color w:val="1F3864"/>
               </w:rPr>
-              <w:t>Nombre de  Actividades/Tareas</w:t>
+              <w:t xml:space="preserve">Nombre </w:t>
+            </w:r>
+            <w:proofErr w:type="gramStart"/>
+            <w:r>
+              <w:rPr>
+                <w:color w:val="1F3864"/>
+              </w:rPr>
+              <w:t>de  Actividades</w:t>
+            </w:r>
+            <w:proofErr w:type="gramEnd"/>
+            <w:r>
+              <w:rPr>
+                <w:color w:val="1F3864"/>
+              </w:rPr>
+              <w:t>/Tareas</w:t>
             </w:r>
           </w:p>
         </w:tc>
@@ -4155,7 +4282,15 @@
               <w:jc w:val="both"/>
             </w:pPr>
             <w:r>
-              <w:t>Ofrecer propuestas de solución informática analizando de forma integral los procesos de acuerdo a los requerimientos definidos.</w:t>
+              <w:t xml:space="preserve">Ofrecer propuestas de solución informática analizando de forma integral los procesos </w:t>
+            </w:r>
+            <w:proofErr w:type="gramStart"/>
+            <w:r>
+              <w:t>de acuerdo a</w:t>
+            </w:r>
+            <w:proofErr w:type="gramEnd"/>
+            <w:r>
+              <w:t xml:space="preserve"> los requerimientos definidos.</w:t>
             </w:r>
           </w:p>
         </w:tc>
@@ -4282,7 +4417,15 @@
               <w:jc w:val="both"/>
             </w:pPr>
             <w:r>
-              <w:t xml:space="preserve">Ofrecer propuestas de solución informática analizando de forma integral los procesos de acuerdo a los </w:t>
+              <w:t xml:space="preserve">Ofrecer propuestas de solución informática analizando de forma integral los procesos </w:t>
+            </w:r>
+            <w:proofErr w:type="gramStart"/>
+            <w:r>
+              <w:t>de acuerdo a</w:t>
+            </w:r>
+            <w:proofErr w:type="gramEnd"/>
+            <w:r>
+              <w:t xml:space="preserve"> los </w:t>
             </w:r>
             <w:r>
               <w:lastRenderedPageBreak/>
@@ -4329,9 +4472,14 @@
             <w:pPr>
               <w:jc w:val="both"/>
             </w:pPr>
+            <w:proofErr w:type="spellStart"/>
             <w:r>
               <w:lastRenderedPageBreak/>
-              <w:t>Figma, Computadores, conexión a internet, plantillas de diseño clínico.</w:t>
+              <w:t>Figma</w:t>
+            </w:r>
+            <w:proofErr w:type="spellEnd"/>
+            <w:r>
+              <w:t>, Computadores, conexión a internet, plantillas de diseño clínico.</w:t>
             </w:r>
           </w:p>
         </w:tc>
@@ -4395,9 +4543,14 @@
             <w:r>
               <w:t xml:space="preserve">Lograr usabilidad e intuición en la </w:t>
             </w:r>
+            <w:proofErr w:type="gramStart"/>
             <w:r>
               <w:lastRenderedPageBreak/>
-              <w:t>app para pacientes de diversas edades.</w:t>
+              <w:t>app</w:t>
+            </w:r>
+            <w:proofErr w:type="gramEnd"/>
+            <w:r>
+              <w:t xml:space="preserve"> para pacientes de diversas edades.</w:t>
             </w:r>
           </w:p>
         </w:tc>
@@ -4416,7 +4569,15 @@
             </w:pPr>
             <w:r>
               <w:lastRenderedPageBreak/>
-              <w:t>Construir modelos de datos para soportar los requerimientos de la solución, de acuerdo a un diseño definido y escalable en el tiempo.</w:t>
+              <w:t xml:space="preserve">Construir modelos de datos para soportar los requerimientos de la solución, </w:t>
+            </w:r>
+            <w:proofErr w:type="gramStart"/>
+            <w:r>
+              <w:t>de acuerdo a</w:t>
+            </w:r>
+            <w:proofErr w:type="gramEnd"/>
+            <w:r>
+              <w:t xml:space="preserve"> un diseño definido y escalable en el tiempo.</w:t>
             </w:r>
           </w:p>
           <w:p>
@@ -4437,7 +4598,15 @@
               <w:jc w:val="both"/>
             </w:pPr>
             <w:r>
-              <w:t>Desarrollo de Backend y Base de Datos</w:t>
+              <w:t xml:space="preserve">Desarrollo de </w:t>
+            </w:r>
+            <w:proofErr w:type="spellStart"/>
+            <w:r>
+              <w:t>Backend</w:t>
+            </w:r>
+            <w:proofErr w:type="spellEnd"/>
+            <w:r>
+              <w:t xml:space="preserve"> y Base de Datos</w:t>
             </w:r>
           </w:p>
         </w:tc>
@@ -4465,7 +4634,7 @@
             <w:r>
               <w:t xml:space="preserve">PostgreSQL, </w:t>
             </w:r>
-            <w:hyperlink r:id="rId9">
+            <w:hyperlink r:id="rId8">
               <w:r>
                 <w:rPr>
                   <w:color w:val="1155CC"/>
@@ -4584,7 +4753,15 @@
               <w:jc w:val="both"/>
             </w:pPr>
             <w:r>
-              <w:t>Desarrollo Frontend Web (Kinesiólogo)</w:t>
+              <w:t xml:space="preserve">Desarrollo </w:t>
+            </w:r>
+            <w:proofErr w:type="spellStart"/>
+            <w:r>
+              <w:t>Frontend</w:t>
+            </w:r>
+            <w:proofErr w:type="spellEnd"/>
+            <w:r>
+              <w:t xml:space="preserve"> Web (Kinesiólogo)</w:t>
             </w:r>
           </w:p>
         </w:tc>
@@ -4610,7 +4787,23 @@
               <w:jc w:val="both"/>
             </w:pPr>
             <w:r>
-              <w:t>React.js/Vue.js, TailwindCSS, librerías de calendario (FullCalendar), VS Code.</w:t>
+              <w:t xml:space="preserve">React.js/Vue.js, </w:t>
+            </w:r>
+            <w:proofErr w:type="spellStart"/>
+            <w:r>
+              <w:t>TailwindCSS</w:t>
+            </w:r>
+            <w:proofErr w:type="spellEnd"/>
+            <w:r>
+              <w:t>, librerías de calendario (</w:t>
+            </w:r>
+            <w:proofErr w:type="spellStart"/>
+            <w:r>
+              <w:t>FullCalendar</w:t>
+            </w:r>
+            <w:proofErr w:type="spellEnd"/>
+            <w:r>
+              <w:t>), VS Code.</w:t>
             </w:r>
           </w:p>
         </w:tc>
@@ -4742,12 +4935,30 @@
               <w:jc w:val="both"/>
             </w:pPr>
             <w:r>
-              <w:t xml:space="preserve">Programación de la app móvil, consumo de la API para rutinas, formulario de </w:t>
-            </w:r>
+              <w:t xml:space="preserve">Programación de la </w:t>
+            </w:r>
+            <w:proofErr w:type="gramStart"/>
+            <w:r>
+              <w:t>app</w:t>
+            </w:r>
+            <w:proofErr w:type="gramEnd"/>
+            <w:r>
+              <w:t xml:space="preserve"> móvil, consumo de la API para rutinas, formulario de </w:t>
+            </w:r>
+            <w:proofErr w:type="spellStart"/>
             <w:r>
               <w:lastRenderedPageBreak/>
-              <w:t>feedback (dolor) y configuración de notificaciones push</w:t>
-            </w:r>
+              <w:t>feedback</w:t>
+            </w:r>
+            <w:proofErr w:type="spellEnd"/>
+            <w:r>
+              <w:t xml:space="preserve"> (dolor) y configuración de notificaciones </w:t>
+            </w:r>
+            <w:proofErr w:type="spellStart"/>
+            <w:r>
+              <w:t>push</w:t>
+            </w:r>
+            <w:proofErr w:type="spellEnd"/>
           </w:p>
         </w:tc>
         <w:tc>
@@ -4766,8 +4977,44 @@
                 <w:lang w:val="en-US"/>
               </w:rPr>
               <w:lastRenderedPageBreak/>
-              <w:t>React Native, Firebase Cloud Messaging (FCM), Emuladores móviles, etc</w:t>
-            </w:r>
+              <w:t xml:space="preserve">React Native, Firebase Cloud Messaging (FCM), </w:t>
+            </w:r>
+            <w:proofErr w:type="spellStart"/>
+            <w:r>
+              <w:rPr>
+                <w:lang w:val="en-US"/>
+              </w:rPr>
+              <w:t>Emuladores</w:t>
+            </w:r>
+            <w:proofErr w:type="spellEnd"/>
+            <w:r>
+              <w:rPr>
+                <w:lang w:val="en-US"/>
+              </w:rPr>
+              <w:t xml:space="preserve"> </w:t>
+            </w:r>
+            <w:proofErr w:type="spellStart"/>
+            <w:r>
+              <w:rPr>
+                <w:lang w:val="en-US"/>
+              </w:rPr>
+              <w:t>móviles</w:t>
+            </w:r>
+            <w:proofErr w:type="spellEnd"/>
+            <w:r>
+              <w:rPr>
+                <w:lang w:val="en-US"/>
+              </w:rPr>
+              <w:t xml:space="preserve">, </w:t>
+            </w:r>
+            <w:proofErr w:type="spellStart"/>
+            <w:r>
+              <w:rPr>
+                <w:lang w:val="en-US"/>
+              </w:rPr>
+              <w:t>etc</w:t>
+            </w:r>
+            <w:proofErr w:type="spellEnd"/>
           </w:p>
         </w:tc>
         <w:tc>
@@ -4887,7 +5134,15 @@
               <w:jc w:val="both"/>
             </w:pPr>
             <w:r>
-              <w:t>Herramientas de testing (Jest, Postman), entorno de pruebas local, dispositivos físicos.</w:t>
+              <w:t xml:space="preserve">Herramientas de </w:t>
+            </w:r>
+            <w:proofErr w:type="spellStart"/>
+            <w:r>
+              <w:t>testing</w:t>
+            </w:r>
+            <w:proofErr w:type="spellEnd"/>
+            <w:r>
+              <w:t xml:space="preserve"> (Jest, Postman), entorno de pruebas local, dispositivos físicos.</w:t>
             </w:r>
           </w:p>
         </w:tc>
@@ -4993,7 +5248,15 @@
               <w:jc w:val="both"/>
             </w:pPr>
             <w:r>
-              <w:t>Redacción de manuales de usuario, compilación del informe final de Capstone, actualización de GitHub y preparación de defensa.</w:t>
+              <w:t xml:space="preserve">Redacción de manuales de usuario, compilación del informe final de </w:t>
+            </w:r>
+            <w:proofErr w:type="spellStart"/>
+            <w:r>
+              <w:t>Capstone</w:t>
+            </w:r>
+            <w:proofErr w:type="spellEnd"/>
+            <w:r>
+              <w:t>, actualización de GitHub y preparación de defensa.</w:t>
             </w:r>
           </w:p>
         </w:tc>
@@ -5265,7 +5528,7 @@
               </w:rPr>
               <w:t xml:space="preserve">LINK DIRECTO: </w:t>
             </w:r>
-            <w:hyperlink r:id="rId10">
+            <w:hyperlink r:id="rId9">
               <w:r>
                 <w:rPr>
                   <w:b/>
@@ -5513,6 +5776,7 @@
       <w:tr>
         <w:trPr>
           <w:gridAfter w:val="1"/>
+          <w:wAfter w:w="10" w:type="dxa"/>
           <w:trHeight w:val="303"/>
         </w:trPr>
         <w:tc>
@@ -6013,6 +6277,7 @@
       <w:tr>
         <w:trPr>
           <w:gridAfter w:val="1"/>
+          <w:wAfter w:w="10" w:type="dxa"/>
           <w:trHeight w:val="294"/>
         </w:trPr>
         <w:tc>
@@ -6353,6 +6618,7 @@
       <w:tr>
         <w:trPr>
           <w:gridAfter w:val="1"/>
+          <w:wAfter w:w="10" w:type="dxa"/>
           <w:trHeight w:val="303"/>
         </w:trPr>
         <w:tc>
@@ -6683,6 +6949,7 @@
       <w:tr>
         <w:trPr>
           <w:gridAfter w:val="1"/>
+          <w:wAfter w:w="10" w:type="dxa"/>
           <w:trHeight w:val="294"/>
         </w:trPr>
         <w:tc>
@@ -7013,7 +7280,7 @@
     </w:tbl>
     <w:p/>
     <w:sectPr>
-      <w:headerReference w:type="default" r:id="rId11"/>
+      <w:headerReference w:type="default" r:id="rId10"/>
       <w:pgSz w:w="11906" w:h="16838"/>
       <w:pgMar w:top="1417" w:right="1701" w:bottom="1417" w:left="1701" w:header="708" w:footer="708" w:gutter="0"/>
       <w:pgNumType w:start="1"/>
@@ -8504,7 +8771,6 @@
   <w:style w:type="character" w:default="1" w:styleId="Fuentedeprrafopredeter">
     <w:name w:val="Default Paragraph Font"/>
     <w:uiPriority w:val="1"/>
-    <w:semiHidden/>
     <w:unhideWhenUsed/>
   </w:style>
   <w:style w:type="table" w:default="1" w:styleId="Tablanormal">
@@ -9050,6 +9316,19 @@
       </w:tblCellMar>
     </w:tblPr>
   </w:style>
+  <w:style w:type="paragraph" w:styleId="NormalWeb">
+    <w:name w:val="Normal (Web)"/>
+    <w:basedOn w:val="Normal"/>
+    <w:uiPriority w:val="99"/>
+    <w:semiHidden/>
+    <w:unhideWhenUsed/>
+    <w:rsid w:val="00132EAF"/>
+    <w:rPr>
+      <w:rFonts w:ascii="Times New Roman" w:hAnsi="Times New Roman" w:cs="Times New Roman"/>
+      <w:sz w:val="24"/>
+      <w:szCs w:val="24"/>
+    </w:rPr>
+  </w:style>
 </w:styles>
 </file>
 

</xml_diff>